<commit_message>
Assignment: add optional multiplayer path (coordinate via D2L forums)
Students may play solo (always sufficient) or, if they find classmates via the
D2L discussion forum, play a multiplayer game with the same deck — the
high-score deliverable and survey work either way.

Co-Authored-By: Claude Opus 4.8 <noreply@anthropic.com>
</commit_message>
<xml_diff>
--- a/docs/The-Historians-Assignment.docx
+++ b/docs/The-Historians-Assignment.docx
@@ -175,7 +175,7 @@
         <w:t xml:space="preserve">Play the game. </w:t>
       </w:r>
       <w:r>
-        <w:t xml:space="preserve">Start a solo game and play through a full career. Use the in-game tutorial hints and the "How to Play" handout if you get stuck. Aim for the highest prestige you can.</w:t>
+        <w:t xml:space="preserve">Play through a full career. You may play on your own (Solo) or, if you can find a classmate to play with, as a Multiplayer game (see "Play With a Classmate" below). Use the in-game tutorial hints and the "How to Play" handout if you get stuck, and aim for the highest prestige you can.</w:t>
       </w:r>
     </w:p>
     <w:p>
@@ -195,7 +195,118 @@
         <w:t xml:space="preserve">Capture your score. </w:t>
       </w:r>
       <w:r>
-        <w:t xml:space="preserve">When your career ends, your Final Prestige is shown on the results screen, and your score is recorded in the Hall of Scholars leaderboard for the deck. Take a screenshot that clearly shows BOTH your score and your username.</w:t>
+        <w:t xml:space="preserve">When your career ends, your Final Prestige is shown on the results screen, and your score is recorded in the Hall of Scholars leaderboard. Take a screenshot that clearly shows BOTH your score and your username.</w:t>
+      </w:r>
+    </w:p>
+    <w:p>
+      <w:pPr>
+        <w:pStyle w:val="Heading1"/>
+      </w:pPr>
+      <w:r>
+        <w:t xml:space="preserve">Play With a Classmate (Optional)</w:t>
+      </w:r>
+    </w:p>
+    <w:p>
+      <w:pPr>
+        <w:spacing w:after="120" w:line="276"/>
+      </w:pPr>
+      <w:r>
+        <w:t xml:space="preserve">You are welcome to experience the multiplayer mode instead of — or in addition to — a solo game. Multiplayer needs 2 to 5 players, so you will need to coordinate with classmates.</w:t>
+      </w:r>
+    </w:p>
+    <w:p>
+      <w:pPr>
+        <w:pStyle w:val="ListParagraph"/>
+        <w:numPr>
+          <w:ilvl w:val="0"/>
+          <w:numId w:val="2"/>
+        </w:numPr>
+        <w:spacing w:after="60" w:line="276"/>
+      </w:pPr>
+      <w:r>
+        <w:rPr>
+          <w:b/>
+          <w:bCs/>
+        </w:rPr>
+        <w:t xml:space="preserve">Find a partner on D2L. </w:t>
+      </w:r>
+      <w:r>
+        <w:t xml:space="preserve">Use the D2L discussion forum to find one or more classmates to play with and agree on a time to meet online.</w:t>
+      </w:r>
+    </w:p>
+    <w:p>
+      <w:pPr>
+        <w:pStyle w:val="ListParagraph"/>
+        <w:numPr>
+          <w:ilvl w:val="0"/>
+          <w:numId w:val="2"/>
+        </w:numPr>
+        <w:spacing w:after="60" w:line="276"/>
+      </w:pPr>
+      <w:r>
+        <w:rPr>
+          <w:b/>
+          <w:bCs/>
+        </w:rPr>
+        <w:t xml:space="preserve">Use the same deck. </w:t>
+      </w:r>
+      <w:r>
+        <w:t xml:space="preserve">Whoever hosts should create the game with the Early American History Study Guide deck. The others join the open game from the multiplayer panel on the home screen.</w:t>
+      </w:r>
+    </w:p>
+    <w:p>
+      <w:pPr>
+        <w:pStyle w:val="ListParagraph"/>
+        <w:numPr>
+          <w:ilvl w:val="0"/>
+          <w:numId w:val="2"/>
+        </w:numPr>
+        <w:spacing w:after="60" w:line="276"/>
+      </w:pPr>
+      <w:r>
+        <w:rPr>
+          <w:b/>
+          <w:bCs/>
+        </w:rPr>
+        <w:t xml:space="preserve">Pick a length. </w:t>
+      </w:r>
+      <w:r>
+        <w:t xml:space="preserve">A Short (10-year) game is the quickest way to experience peer review, conferences, and the end-of-game awards together.</w:t>
+      </w:r>
+    </w:p>
+    <w:p>
+      <w:pPr>
+        <w:pStyle w:val="ListParagraph"/>
+        <w:numPr>
+          <w:ilvl w:val="0"/>
+          <w:numId w:val="2"/>
+        </w:numPr>
+        <w:spacing w:after="60" w:line="276"/>
+      </w:pPr>
+      <w:r>
+        <w:rPr>
+          <w:b/>
+          <w:bCs/>
+        </w:rPr>
+        <w:t xml:space="preserve">Same deliverable. </w:t>
+      </w:r>
+      <w:r>
+        <w:t xml:space="preserve">A multiplayer game still produces a final score with your username, recorded on the multiplayer leaderboard for the length you played — screenshot it the same way.</w:t>
+      </w:r>
+    </w:p>
+    <w:p>
+      <w:pPr>
+        <w:spacing w:after="120" w:line="276"/>
+      </w:pPr>
+      <w:r>
+        <w:rPr>
+          <w:b/>
+          <w:bCs/>
+        </w:rPr>
+        <w:t xml:space="preserve">Either mode satisfies the assignment. </w:t>
+      </w:r>
+      <w:r>
+        <w:t xml:space="preserve">A solo game is always enough; multiplayer is an option for those who want the full experience.</w:t>
       </w:r>
     </w:p>
     <w:p>

</xml_diff>

<commit_message>
Handouts: tell students to turn on Significance to read the history
Adds a tip to both the assignment ("Tips") and the how-to-play guide
("The Cards") explaining that turning on Significance and clicking a card
reveals the historical-significance note behind each source.

Co-Authored-By: Claude Opus 4.8 <noreply@anthropic.com>
</commit_message>
<xml_diff>
--- a/docs/The-Historians-Assignment.docx
+++ b/docs/The-Historians-Assignment.docx
@@ -761,6 +761,26 @@
         <w:spacing w:after="60" w:line="276"/>
       </w:pPr>
       <w:r>
+        <w:rPr>
+          <w:b/>
+          <w:bCs/>
+        </w:rPr>
+        <w:t xml:space="preserve">Turn on "Significance." </w:t>
+      </w:r>
+      <w:r>
+        <w:t xml:space="preserve">In the game header, click the Significance button, then click a card to open it and read the historical-significance note behind each source — a quick way to learn the history (and to judge which evidence fits your argument).</w:t>
+      </w:r>
+    </w:p>
+    <w:p>
+      <w:pPr>
+        <w:pStyle w:val="ListParagraph"/>
+        <w:numPr>
+          <w:ilvl w:val="0"/>
+          <w:numId w:val="2"/>
+        </w:numPr>
+        <w:spacing w:after="60" w:line="276"/>
+      </w:pPr>
+      <w:r>
         <w:t xml:space="preserve">Read the cards. The evidence only counts toward a thesis when it shares a tag (theme) with the conclusion — and grouping evidence that shares the same author, place, date, or source type can double your prestige.</w:t>
       </w:r>
     </w:p>

</xml_diff>

<commit_message>
Multiplayer: download your Collected Works + study-guide instructions
- Add a "View / Print My Works" button to the multiplayer Final Standings
  screen that exports the current player's own publications (reusing the
  single-player WorksPage / Print-to-PDF pipeline via a new
  exportMultiplayerWorks adapter).
- Enrich the publish-time evidence snapshot (mp_resolveYear.php) with each
  card's date/content/significance/citation so the exported works carry the
  full study-guide detail. JSON column — no DB migration needed; applies to
  publications made after deploy.
- Handouts: add a "Save Your Works as a Study Guide" section to How-to-Play
  (solo + multiplayer steps) and a study-guide tip to the assignment,
  framing the downloadable publications as a review sheet for the deck.

Co-Authored-By: Claude Opus 4.8 <noreply@anthropic.com>
</commit_message>
<xml_diff>
--- a/docs/The-Historians-Assignment.docx
+++ b/docs/The-Historians-Assignment.docx
@@ -807,6 +807,26 @@
         <w:spacing w:after="60" w:line="276"/>
       </w:pPr>
       <w:r>
+        <w:rPr>
+          <w:b/>
+          <w:bCs/>
+        </w:rPr>
+        <w:t xml:space="preserve">Keep a study guide. </w:t>
+      </w:r>
+      <w:r>
+        <w:t xml:space="preserve">When your game ends, click "View / Print My Works" on the results screen (in multiplayer, the Final Standings screen) to open your published articles and books as a printable document. Each one lists its thesis and a table of all its evidence with the historical-significance notes — save it as a PDF and you have a ready-made review sheet for the deck’s material.</w:t>
+      </w:r>
+    </w:p>
+    <w:p>
+      <w:pPr>
+        <w:pStyle w:val="ListParagraph"/>
+        <w:numPr>
+          <w:ilvl w:val="0"/>
+          <w:numId w:val="2"/>
+        </w:numPr>
+        <w:spacing w:after="60" w:line="276"/>
+      </w:pPr>
+      <w:r>
         <w:t xml:space="preserve">Turn on tutorial hints from the header if you want step-by-step guidance, and open "How to Play" any time for a quick reference.</w:t>
       </w:r>
     </w:p>

</xml_diff>